<commit_message>
feat: LNG-001 otomatik düzeltme + LNG-005 regex fix + download adım gösterimi
LNG-001 (cümle başı büyük harf):
- Layer A zaten tespit ediyordu; fixer artık otomatik düzeltiyor
- Run sınırlarını koruyan karakter-bazlı eşleştirme (_fix_sentence_case_para)
- Türkçe i→İ özel dönüşümü (_TR_UPPER)

LNG-005 (virgül/noktalı virgül sonrası boşluk):
- Eski regex yalnızca word,word yakalarken yeni regex [,;]harf kalıbını yakalar
- "durum ,ilgili" (boşluk+virgül+harf) artık da tespit edilip düzeltiliyor
- Fixer regex da güncellendi: ([,;])([Aa-z...]) → \1 \2

Test dosyası:
- test_language_errors.docx'e açık LNG-005 test vakası eklendi
- Fixture yeniden oluşturuldu

UI:
- "Düzeltilmiş Belgeyi İndir" butonunda 3 adımlı ilerleme paneli
  (analiz → düzeltme → dosya hazırlama) indirme sırasında gösterilir
</commit_message>
<xml_diff>
--- a/backend/tests/fixtures/test_language_errors.docx
+++ b/backend/tests/fixtures/test_language_errors.docx
@@ -143,6 +143,19 @@
           <w:sz w:val="24"/>
         </w:rPr>
         <w:t>Söz konusu durum ,ilgili birimlerle paylaşılmıştır.</w:t>
+      </w:r>
+    </w:p>
+    <w:p>
+      <w:pPr>
+        <w:jc w:val="both"/>
+      </w:pPr>
+      <w:r>
+        <w:rPr>
+          <w:rFonts w:ascii="Times New Roman" w:hAnsi="Times New Roman"/>
+          <w:b w:val="0"/>
+          <w:sz w:val="24"/>
+        </w:rPr>
+        <w:t>Evraklar tamamlanmış,inceleme süreci başlatılmıştır.</w:t>
       </w:r>
     </w:p>
     <w:p>

</xml_diff>